<commit_message>
Update of the Repository
</commit_message>
<xml_diff>
--- a/Data/Transcriptomics.docx
+++ b/Data/Transcriptomics.docx
@@ -25,21 +25,7 @@
           <w:lang w:val="en-US"/>
         </w:rPr>
         <w:br/>
-        <w:t xml:space="preserve">This is a processed </w:t>
-      </w:r>
-      <w:proofErr w:type="spellStart"/>
-      <w:r>
-        <w:rPr>
-          <w:lang w:val="en-US"/>
-        </w:rPr>
-        <w:t>RNAseq</w:t>
-      </w:r>
-      <w:proofErr w:type="spellEnd"/>
-      <w:r>
-        <w:rPr>
-          <w:lang w:val="en-US"/>
-        </w:rPr>
-        <w:t xml:space="preserve"> dataset involving reading in quantitated gene expression data from an RNA-seq experiment, exploring the data using base R functions and then interpretation. The dataset contains an experiment between a diseased cell line and diseased cell lines treated with compound X. The difference in expression </w:t>
+        <w:t xml:space="preserve">This is a processed RNAseq dataset involving reading in quantitated gene expression data from an RNA-seq experiment, exploring the data using base R functions and then interpretation. The dataset contains an experiment between a diseased cell line and diseased cell lines treated with compound X. The difference in expression </w:t>
       </w:r>
       <w:proofErr w:type="gramStart"/>
       <w:r>
@@ -78,34 +64,17 @@
       <w:r>
         <w:t>Access </w:t>
       </w:r>
-      <w:proofErr w:type="spellStart"/>
-      <w:r>
-        <w:fldChar w:fldCharType="begin"/>
-      </w:r>
-      <w:r>
-        <w:instrText>HYPERLINK "https://gist.githubusercontent.com/stephenturner/806e31fce55a8b7175af/raw/1a507c4c3f9f1baaa3a69187223ff3d3050628d4/results.txt" \t "_blank"</w:instrText>
-      </w:r>
-      <w:r>
-        <w:fldChar w:fldCharType="separate"/>
-      </w:r>
-      <w:r>
-        <w:rPr>
-          <w:rStyle w:val="Hyperlink"/>
-        </w:rPr>
-        <w:t>Dataset</w:t>
-      </w:r>
-      <w:proofErr w:type="spellEnd"/>
-      <w:r>
-        <w:fldChar w:fldCharType="end"/>
-      </w:r>
-      <w:r>
-        <w:t> </w:t>
-      </w:r>
-      <w:proofErr w:type="spellStart"/>
-      <w:r>
-        <w:t>Here</w:t>
-      </w:r>
-      <w:proofErr w:type="spellEnd"/>
+      <w:hyperlink r:id="rId5" w:tgtFrame="_blank" w:history="1">
+        <w:r>
+          <w:rPr>
+            <w:rStyle w:val="Hyperlink"/>
+          </w:rPr>
+          <w:t>Dataset</w:t>
+        </w:r>
+      </w:hyperlink>
+      <w:r>
+        <w:t> Here</w:t>
+      </w:r>
       <w:r>
         <w:br/>
       </w:r>
@@ -153,21 +122,7 @@
         <w:rPr>
           <w:lang w:val="en-US"/>
         </w:rPr>
-        <w:t xml:space="preserve">Determine the upregulated genes (Genes with Log2FC &gt; 1 and </w:t>
-      </w:r>
-      <w:proofErr w:type="spellStart"/>
-      <w:r>
-        <w:rPr>
-          <w:lang w:val="en-US"/>
-        </w:rPr>
-        <w:t>pvalue</w:t>
-      </w:r>
-      <w:proofErr w:type="spellEnd"/>
-      <w:r>
-        <w:rPr>
-          <w:lang w:val="en-US"/>
-        </w:rPr>
-        <w:t xml:space="preserve"> &lt; 0.01)</w:t>
+        <w:t>Determine the upregulated genes (Genes with Log2FC &gt; 1 and pvalue &lt; 0.01)</w:t>
       </w:r>
     </w:p>
     <w:p>
@@ -185,21 +140,19 @@
         <w:rPr>
           <w:lang w:val="en-US"/>
         </w:rPr>
-        <w:t xml:space="preserve">Determine the upregulated genes (Genes with Log2FC &lt; -1 and </w:t>
-      </w:r>
-      <w:proofErr w:type="spellStart"/>
-      <w:r>
-        <w:rPr>
-          <w:lang w:val="en-US"/>
-        </w:rPr>
-        <w:t>pvalue</w:t>
-      </w:r>
-      <w:proofErr w:type="spellEnd"/>
-      <w:r>
-        <w:rPr>
-          <w:lang w:val="en-US"/>
-        </w:rPr>
-        <w:t xml:space="preserve"> &lt; 0.01)</w:t>
+        <w:t xml:space="preserve">Determine the </w:t>
+      </w:r>
+      <w:r>
+        <w:rPr>
+          <w:lang w:val="en-US"/>
+        </w:rPr>
+        <w:t>downregulated</w:t>
+      </w:r>
+      <w:r>
+        <w:rPr>
+          <w:lang w:val="en-US"/>
+        </w:rPr>
+        <w:t xml:space="preserve"> genes (Genes with Log2FC &lt; -1 and pvalue &lt; 0.01)</w:t>
       </w:r>
     </w:p>
     <w:p>
@@ -217,15 +170,7 @@
         <w:t xml:space="preserve">What are the functions of the top 5 upregulated genes and top 5 downregulated genes. </w:t>
       </w:r>
       <w:r>
-        <w:t xml:space="preserve">(Use </w:t>
-      </w:r>
-      <w:proofErr w:type="spellStart"/>
-      <w:r>
-        <w:t>genecards</w:t>
-      </w:r>
-      <w:proofErr w:type="spellEnd"/>
-      <w:r>
-        <w:t>)</w:t>
+        <w:t>(Use genecards)</w:t>
       </w:r>
     </w:p>
     <w:p/>

</xml_diff>